<commit_message>
docs: client guide — install/run OpenCode from the terminal
Clarify OpenCode is a terminal app (no separate GUI vs terminal): add the
install commands (npm / scoop / choco / curl), how to start it (opencode),
check it (opencode --version), and /mcp to list servers. Updated both
client-config/README.md and the Word user guide (.docx).
</commit_message>
<xml_diff>
--- a/client-config/MSEI-Publication-Search-User-Guide.docx
+++ b/client-config/MSEI-Publication-Search-User-Guide.docx
@@ -131,7 +131,7 @@
       <w:r>
         <w:t xml:space="preserve"> installed — </w:t>
       </w:r>
-      <w:hyperlink w:history="1" r:id="rId1gnqag4ofwip-4va5e95i">
+      <w:hyperlink w:history="1" r:id="rIdyxzbvqxaefe73dra7iaod">
         <w:r>
           <w:rPr>
             <w:rStyle w:val="Hyperlink"/>
@@ -192,6 +192,183 @@
           <w:szCs w:val="19"/>
         </w:rPr>
         <w:t xml:space="preserve">http://10.76.33.35:8080/mcp</w:t>
+      </w:r>
+    </w:p>
+    <w:p>
+      <w:pPr>
+        <w:pStyle w:val="Heading2"/>
+      </w:pPr>
+      <w:r>
+        <w:t xml:space="preserve">Installing OpenCode (it’s a terminal app)</w:t>
+      </w:r>
+    </w:p>
+    <w:p>
+      <w:pPr>
+        <w:spacing w:after="120" w:line="276"/>
+      </w:pPr>
+      <w:r>
+        <w:t xml:space="preserve">OpenCode runs in a </w:t>
+      </w:r>
+      <w:r>
+        <w:rPr>
+          <w:b/>
+          <w:bCs/>
+        </w:rPr>
+        <w:t xml:space="preserve">terminal</w:t>
+      </w:r>
+      <w:r>
+        <w:t xml:space="preserve"> — there is no separate “software” vs “terminal” version. You install it once with a command, then start it by typing </w:t>
+      </w:r>
+      <w:r>
+        <w:rPr>
+          <w:rFonts w:ascii="Consolas" w:cs="Consolas" w:eastAsia="Consolas" w:hAnsi="Consolas"/>
+          <w:sz w:val="19"/>
+          <w:szCs w:val="19"/>
+        </w:rPr>
+        <w:t xml:space="preserve">opencode</w:t>
+      </w:r>
+      <w:r>
+        <w:t xml:space="preserve">. Configuring it (the token + config file) is the same however you launch it. Install with one of:</w:t>
+      </w:r>
+    </w:p>
+    <w:tbl>
+      <w:tblPr>
+        <w:tblW w:type="dxa" w:w="9360"/>
+        <w:tblBorders>
+          <w:top w:val="single" w:color="auto" w:sz="4"/>
+          <w:left w:val="single" w:color="auto" w:sz="4"/>
+          <w:bottom w:val="single" w:color="auto" w:sz="4"/>
+          <w:right w:val="single" w:color="auto" w:sz="4"/>
+          <w:insideH w:val="single" w:color="auto" w:sz="4"/>
+          <w:insideV w:val="single" w:color="auto" w:sz="4"/>
+        </w:tblBorders>
+      </w:tblPr>
+      <w:tblGrid>
+        <w:gridCol w:w="9360"/>
+      </w:tblGrid>
+      <w:tr>
+        <w:tc>
+          <w:tcPr>
+            <w:tcW w:type="dxa" w:w="9360"/>
+            <w:tcBorders>
+              <w:top w:val="single" w:color="D9D9D9" w:sz="4"/>
+              <w:left w:val="single" w:color="D9D9D9" w:sz="4"/>
+              <w:bottom w:val="single" w:color="D9D9D9" w:sz="4"/>
+              <w:right w:val="single" w:color="D9D9D9" w:sz="4"/>
+            </w:tcBorders>
+            <w:shd w:fill="F4F4F4" w:val="clear"/>
+            <w:tcMar>
+              <w:top w:type="dxa" w:w="100"/>
+              <w:left w:type="dxa" w:w="150"/>
+              <w:bottom w:type="dxa" w:w="100"/>
+              <w:right w:type="dxa" w:w="150"/>
+            </w:tcMar>
+          </w:tcPr>
+          <w:p>
+            <w:pPr>
+              <w:spacing w:after="0" w:line="252"/>
+            </w:pPr>
+            <w:r>
+              <w:rPr>
+                <w:rFonts w:ascii="Consolas" w:cs="Consolas" w:eastAsia="Consolas" w:hAnsi="Consolas"/>
+                <w:sz w:val="18"/>
+                <w:szCs w:val="18"/>
+              </w:rPr>
+              <w:t xml:space="preserve">npm install -g opencode-ai        # anywhere Node.js is installed (easiest on Windows)</w:t>
+            </w:r>
+          </w:p>
+          <w:p>
+            <w:pPr>
+              <w:spacing w:after="0" w:line="252"/>
+            </w:pPr>
+            <w:r>
+              <w:rPr>
+                <w:rFonts w:ascii="Consolas" w:cs="Consolas" w:eastAsia="Consolas" w:hAnsi="Consolas"/>
+                <w:sz w:val="18"/>
+                <w:szCs w:val="18"/>
+              </w:rPr>
+              <w:t xml:space="preserve">scoop install opencode            # or, Windows: Scoop</w:t>
+            </w:r>
+          </w:p>
+          <w:p>
+            <w:pPr>
+              <w:spacing w:after="0" w:line="252"/>
+            </w:pPr>
+            <w:r>
+              <w:rPr>
+                <w:rFonts w:ascii="Consolas" w:cs="Consolas" w:eastAsia="Consolas" w:hAnsi="Consolas"/>
+                <w:sz w:val="18"/>
+                <w:szCs w:val="18"/>
+              </w:rPr>
+              <w:t xml:space="preserve">choco install opencode            # or, Windows: Chocolatey</w:t>
+            </w:r>
+          </w:p>
+          <w:p>
+            <w:pPr>
+              <w:spacing w:after="0" w:line="252"/>
+            </w:pPr>
+            <w:r>
+              <w:rPr>
+                <w:rFonts w:ascii="Consolas" w:cs="Consolas" w:eastAsia="Consolas" w:hAnsi="Consolas"/>
+                <w:sz w:val="18"/>
+                <w:szCs w:val="18"/>
+              </w:rPr>
+              <w:t xml:space="preserve">curl -fsSL https://opencode.ai/install | bash   # macOS / Linux / WSL</w:t>
+            </w:r>
+          </w:p>
+        </w:tc>
+      </w:tr>
+    </w:tbl>
+    <w:p>
+      <w:pPr>
+        <w:spacing w:after="120" w:line="276"/>
+      </w:pPr>
+      <w:r>
+        <w:t xml:space="preserve">Check it with </w:t>
+      </w:r>
+      <w:r>
+        <w:rPr>
+          <w:rFonts w:ascii="Consolas" w:cs="Consolas" w:eastAsia="Consolas" w:hAnsi="Consolas"/>
+          <w:sz w:val="19"/>
+          <w:szCs w:val="19"/>
+        </w:rPr>
+        <w:t xml:space="preserve">opencode --version</w:t>
+      </w:r>
+      <w:r>
+        <w:t xml:space="preserve">, then start it in your working folder with </w:t>
+      </w:r>
+      <w:r>
+        <w:rPr>
+          <w:rFonts w:ascii="Consolas" w:cs="Consolas" w:eastAsia="Consolas" w:hAnsi="Consolas"/>
+          <w:sz w:val="19"/>
+          <w:szCs w:val="19"/>
+        </w:rPr>
+        <w:t xml:space="preserve">opencode</w:t>
+      </w:r>
+      <w:r>
+        <w:t xml:space="preserve">. Inside OpenCode, </w:t>
+      </w:r>
+      <w:r>
+        <w:rPr>
+          <w:rFonts w:ascii="Consolas" w:cs="Consolas" w:eastAsia="Consolas" w:hAnsi="Consolas"/>
+          <w:sz w:val="19"/>
+          <w:szCs w:val="19"/>
+        </w:rPr>
+        <w:t xml:space="preserve">/mcp</w:t>
+      </w:r>
+      <w:r>
+        <w:t xml:space="preserve"> lists connected servers — you’ll see </w:t>
+      </w:r>
+      <w:r>
+        <w:rPr>
+          <w:rFonts w:ascii="Consolas" w:cs="Consolas" w:eastAsia="Consolas" w:hAnsi="Consolas"/>
+          <w:sz w:val="19"/>
+          <w:szCs w:val="19"/>
+        </w:rPr>
+        <w:t xml:space="preserve">msei-publications</w:t>
+      </w:r>
+      <w:r>
+        <w:t xml:space="preserve"> after Step 2.</w:t>
       </w:r>
     </w:p>
     <w:p>

</xml_diff>

<commit_message>
docs: client guide — OpenCode MCP setup for Windows & macOS
Add OS-specific config steps (Windows PowerShell + macOS/Linux Terminal, or by
hand), the VM connection details (URL/IP, /mcp, http vs https, X-User,
type=remote), and an 'add just the mcp block' snippet for users who already
have an opencode.json. Updated the Word user guide (.docx) and
client-config/README.md.
</commit_message>
<xml_diff>
--- a/client-config/MSEI-Publication-Search-User-Guide.docx
+++ b/client-config/MSEI-Publication-Search-User-Guide.docx
@@ -131,7 +131,7 @@
       <w:r>
         <w:t xml:space="preserve"> installed — </w:t>
       </w:r>
-      <w:hyperlink w:history="1" r:id="rIdyxzbvqxaefe73dra7iaod">
+      <w:hyperlink w:history="1" r:id="rIde8hhtsrx7bb0qoopgov-j">
         <w:r>
           <w:rPr>
             <w:rStyle w:val="Hyperlink"/>
@@ -860,7 +860,22 @@
         <w:pStyle w:val="Heading2"/>
       </w:pPr>
       <w:r>
-        <w:t xml:space="preserve">Open it from the terminal (creates it if missing)</w:t>
+        <w:t xml:space="preserve">Create / open the config — Windows or macOS (terminal or by hand)</w:t>
+      </w:r>
+    </w:p>
+    <w:p>
+      <w:pPr>
+        <w:spacing w:after="120" w:line="276"/>
+      </w:pPr>
+      <w:r>
+        <w:rPr>
+          <w:b/>
+          <w:bCs/>
+        </w:rPr>
+        <w:t xml:space="preserve">Windows</w:t>
+      </w:r>
+      <w:r>
+        <w:t xml:space="preserve"> — in PowerShell:</w:t>
       </w:r>
     </w:p>
     <w:tbl>
@@ -906,33 +921,7 @@
                 <w:sz w:val="18"/>
                 <w:szCs w:val="18"/>
               </w:rPr>
-              <w:t xml:space="preserve"># if the folder doesn't exist yet:</w:t>
-            </w:r>
-          </w:p>
-          <w:p>
-            <w:pPr>
-              <w:spacing w:after="0" w:line="252"/>
-            </w:pPr>
-            <w:r>
-              <w:rPr>
-                <w:rFonts w:ascii="Consolas" w:cs="Consolas" w:eastAsia="Consolas" w:hAnsi="Consolas"/>
-                <w:sz w:val="18"/>
-                <w:szCs w:val="18"/>
-              </w:rPr>
-              <w:t xml:space="preserve">mkdir $env:USERPROFILE\.config\opencode</w:t>
-            </w:r>
-          </w:p>
-          <w:p>
-            <w:pPr>
-              <w:spacing w:after="0" w:line="252"/>
-            </w:pPr>
-            <w:r>
-              <w:rPr>
-                <w:rFonts w:ascii="Consolas" w:cs="Consolas" w:eastAsia="Consolas" w:hAnsi="Consolas"/>
-                <w:sz w:val="18"/>
-                <w:szCs w:val="18"/>
-              </w:rPr>
-              <w:t xml:space="preserve"># open the file in Notepad:</w:t>
+              <w:t xml:space="preserve">mkdir $env:USERPROFILE\.config\opencode      # ignore the error if it already exists</w:t>
             </w:r>
           </w:p>
           <w:p>
@@ -953,10 +942,17 @@
     </w:tbl>
     <w:p>
       <w:pPr>
-        <w:pStyle w:val="Heading2"/>
-      </w:pPr>
-      <w:r>
-        <w:t xml:space="preserve">Paste this, then change X-User to your name and save</w:t>
+        <w:spacing w:after="120" w:line="276"/>
+      </w:pPr>
+      <w:r>
+        <w:rPr>
+          <w:b/>
+          <w:bCs/>
+        </w:rPr>
+        <w:t xml:space="preserve">macOS / Linux</w:t>
+      </w:r>
+      <w:r>
+        <w:t xml:space="preserve"> — in Terminal:</w:t>
       </w:r>
     </w:p>
     <w:tbl>
@@ -1002,6 +998,105 @@
                 <w:sz w:val="18"/>
                 <w:szCs w:val="18"/>
               </w:rPr>
+              <w:t xml:space="preserve">mkdir -p ~/.config/opencode</w:t>
+            </w:r>
+          </w:p>
+          <w:p>
+            <w:pPr>
+              <w:spacing w:after="0" w:line="252"/>
+            </w:pPr>
+            <w:r>
+              <w:rPr>
+                <w:rFonts w:ascii="Consolas" w:cs="Consolas" w:eastAsia="Consolas" w:hAnsi="Consolas"/>
+                <w:sz w:val="18"/>
+                <w:szCs w:val="18"/>
+              </w:rPr>
+              <w:t xml:space="preserve">open -e ~/.config/opencode/opencode.json        # or:  nano ~/.config/opencode/opencode.json</w:t>
+            </w:r>
+          </w:p>
+        </w:tc>
+      </w:tr>
+    </w:tbl>
+    <w:p>
+      <w:pPr>
+        <w:spacing w:after="120" w:line="276"/>
+      </w:pPr>
+      <w:r>
+        <w:t xml:space="preserve">Prefer to do it </w:t>
+      </w:r>
+      <w:r>
+        <w:rPr>
+          <w:b/>
+          <w:bCs/>
+        </w:rPr>
+        <w:t xml:space="preserve">by hand</w:t>
+      </w:r>
+      <w:r>
+        <w:t xml:space="preserve">? Open that path in any text editor and create the file if it's missing (on macOS: Finder → Go → Go to Folder → type </w:t>
+      </w:r>
+      <w:r>
+        <w:rPr>
+          <w:rFonts w:ascii="Consolas" w:cs="Consolas" w:eastAsia="Consolas" w:hAnsi="Consolas"/>
+          <w:sz w:val="19"/>
+          <w:szCs w:val="19"/>
+        </w:rPr>
+        <w:t xml:space="preserve">~/.config/opencode</w:t>
+      </w:r>
+      <w:r>
+        <w:t xml:space="preserve">).</w:t>
+      </w:r>
+    </w:p>
+    <w:p>
+      <w:pPr>
+        <w:pStyle w:val="Heading2"/>
+      </w:pPr>
+      <w:r>
+        <w:t xml:space="preserve">Paste this, then change X-User to your name and save</w:t>
+      </w:r>
+    </w:p>
+    <w:tbl>
+      <w:tblPr>
+        <w:tblW w:type="dxa" w:w="9360"/>
+        <w:tblBorders>
+          <w:top w:val="single" w:color="auto" w:sz="4"/>
+          <w:left w:val="single" w:color="auto" w:sz="4"/>
+          <w:bottom w:val="single" w:color="auto" w:sz="4"/>
+          <w:right w:val="single" w:color="auto" w:sz="4"/>
+          <w:insideH w:val="single" w:color="auto" w:sz="4"/>
+          <w:insideV w:val="single" w:color="auto" w:sz="4"/>
+        </w:tblBorders>
+      </w:tblPr>
+      <w:tblGrid>
+        <w:gridCol w:w="9360"/>
+      </w:tblGrid>
+      <w:tr>
+        <w:tc>
+          <w:tcPr>
+            <w:tcW w:type="dxa" w:w="9360"/>
+            <w:tcBorders>
+              <w:top w:val="single" w:color="D9D9D9" w:sz="4"/>
+              <w:left w:val="single" w:color="D9D9D9" w:sz="4"/>
+              <w:bottom w:val="single" w:color="D9D9D9" w:sz="4"/>
+              <w:right w:val="single" w:color="D9D9D9" w:sz="4"/>
+            </w:tcBorders>
+            <w:shd w:fill="F4F4F4" w:val="clear"/>
+            <w:tcMar>
+              <w:top w:type="dxa" w:w="100"/>
+              <w:left w:type="dxa" w:w="150"/>
+              <w:bottom w:type="dxa" w:w="100"/>
+              <w:right w:type="dxa" w:w="150"/>
+            </w:tcMar>
+          </w:tcPr>
+          <w:p>
+            <w:pPr>
+              <w:spacing w:after="0" w:line="252"/>
+            </w:pPr>
+            <w:r>
+              <w:rPr>
+                <w:rFonts w:ascii="Consolas" w:cs="Consolas" w:eastAsia="Consolas" w:hAnsi="Consolas"/>
+                <w:sz w:val="18"/>
+                <w:szCs w:val="18"/>
+              </w:rPr>
               <w:t xml:space="preserve">{</w:t>
             </w:r>
           </w:p>
@@ -1341,6 +1436,327 @@
                 <w:szCs w:val="18"/>
               </w:rPr>
               <w:t xml:space="preserve">    }</w:t>
+            </w:r>
+          </w:p>
+          <w:p>
+            <w:pPr>
+              <w:spacing w:after="0" w:line="252"/>
+            </w:pPr>
+            <w:r>
+              <w:rPr>
+                <w:rFonts w:ascii="Consolas" w:cs="Consolas" w:eastAsia="Consolas" w:hAnsi="Consolas"/>
+                <w:sz w:val="18"/>
+                <w:szCs w:val="18"/>
+              </w:rPr>
+              <w:t xml:space="preserve">  }</w:t>
+            </w:r>
+          </w:p>
+          <w:p>
+            <w:pPr>
+              <w:spacing w:after="0" w:line="252"/>
+            </w:pPr>
+            <w:r>
+              <w:rPr>
+                <w:rFonts w:ascii="Consolas" w:cs="Consolas" w:eastAsia="Consolas" w:hAnsi="Consolas"/>
+                <w:sz w:val="18"/>
+                <w:szCs w:val="18"/>
+              </w:rPr>
+              <w:t xml:space="preserve">}</w:t>
+            </w:r>
+          </w:p>
+        </w:tc>
+      </w:tr>
+    </w:tbl>
+    <w:p>
+      <w:pPr>
+        <w:spacing w:after="60"/>
+      </w:pPr>
+    </w:p>
+    <w:p>
+      <w:pPr>
+        <w:pStyle w:val="Heading2"/>
+      </w:pPr>
+      <w:r>
+        <w:t xml:space="preserve">Connecting to the VM — the details</w:t>
+      </w:r>
+    </w:p>
+    <w:tbl>
+      <w:tblPr>
+        <w:tblW w:type="dxa" w:w="9360"/>
+        <w:tblBorders>
+          <w:top w:val="single" w:color="auto" w:sz="4"/>
+          <w:left w:val="single" w:color="auto" w:sz="4"/>
+          <w:bottom w:val="single" w:color="auto" w:sz="4"/>
+          <w:right w:val="single" w:color="auto" w:sz="4"/>
+          <w:insideH w:val="single" w:color="auto" w:sz="4"/>
+          <w:insideV w:val="single" w:color="auto" w:sz="4"/>
+        </w:tblBorders>
+      </w:tblPr>
+      <w:tblGrid>
+        <w:gridCol w:w="9360"/>
+      </w:tblGrid>
+      <w:tr>
+        <w:tc>
+          <w:tcPr>
+            <w:tcW w:type="dxa" w:w="9360"/>
+            <w:tcBorders>
+              <w:top w:val="single" w:color="FFFFFF" w:sz="1"/>
+              <w:left w:val="single" w:color="185FA5" w:sz="18"/>
+              <w:bottom w:val="single" w:color="FFFFFF" w:sz="1"/>
+              <w:right w:val="single" w:color="FFFFFF" w:sz="1"/>
+            </w:tcBorders>
+            <w:shd w:fill="EAF1FB" w:val="clear"/>
+            <w:tcMar>
+              <w:top w:type="dxa" w:w="100"/>
+              <w:left w:type="dxa" w:w="180"/>
+              <w:bottom w:type="dxa" w:w="100"/>
+              <w:right w:type="dxa" w:w="150"/>
+            </w:tcMar>
+          </w:tcPr>
+          <w:p>
+            <w:pPr>
+              <w:spacing w:after="0" w:line="276"/>
+            </w:pPr>
+            <w:r>
+              <w:rPr>
+                <w:b/>
+                <w:bCs/>
+              </w:rPr>
+              <w:t xml:space="preserve">Three things connect you to the server: </w:t>
+            </w:r>
+            <w:r>
+              <w:t xml:space="preserve">the </w:t>
+            </w:r>
+            <w:r>
+              <w:rPr>
+                <w:b/>
+                <w:bCs/>
+              </w:rPr>
+              <w:t xml:space="preserve">URL</w:t>
+            </w:r>
+            <w:r>
+              <w:t xml:space="preserve"> </w:t>
+            </w:r>
+            <w:r>
+              <w:rPr>
+                <w:rFonts w:ascii="Consolas" w:cs="Consolas" w:eastAsia="Consolas" w:hAnsi="Consolas"/>
+                <w:sz w:val="19"/>
+                <w:szCs w:val="19"/>
+              </w:rPr>
+              <w:t xml:space="preserve">http://&lt;VM-IP&gt;:8080/mcp</w:t>
+            </w:r>
+            <w:r>
+              <w:t xml:space="preserve"> (the address from your admin — this deployment is </w:t>
+            </w:r>
+            <w:r>
+              <w:rPr>
+                <w:rFonts w:ascii="Consolas" w:cs="Consolas" w:eastAsia="Consolas" w:hAnsi="Consolas"/>
+                <w:sz w:val="19"/>
+                <w:szCs w:val="19"/>
+              </w:rPr>
+              <w:t xml:space="preserve">http://10.76.33.35:8080/mcp</w:t>
+            </w:r>
+            <w:r>
+              <w:t xml:space="preserve">; it must be </w:t>
+            </w:r>
+            <w:r>
+              <w:rPr>
+                <w:rFonts w:ascii="Consolas" w:cs="Consolas" w:eastAsia="Consolas" w:hAnsi="Consolas"/>
+                <w:sz w:val="19"/>
+                <w:szCs w:val="19"/>
+              </w:rPr>
+              <w:t xml:space="preserve">http</w:t>
+            </w:r>
+            <w:r>
+              <w:t xml:space="preserve"> not https, and end in </w:t>
+            </w:r>
+            <w:r>
+              <w:rPr>
+                <w:rFonts w:ascii="Consolas" w:cs="Consolas" w:eastAsia="Consolas" w:hAnsi="Consolas"/>
+                <w:sz w:val="19"/>
+                <w:szCs w:val="19"/>
+              </w:rPr>
+              <w:t xml:space="preserve">/mcp</w:t>
+            </w:r>
+            <w:r>
+              <w:t xml:space="preserve">); </w:t>
+            </w:r>
+            <w:r>
+              <w:rPr>
+                <w:rFonts w:ascii="Consolas" w:cs="Consolas" w:eastAsia="Consolas" w:hAnsi="Consolas"/>
+                <w:sz w:val="19"/>
+                <w:szCs w:val="19"/>
+              </w:rPr>
+              <w:t xml:space="preserve">"type": "remote"</w:t>
+            </w:r>
+            <w:r>
+              <w:t xml:space="preserve"> (a network server, not a local program); and </w:t>
+            </w:r>
+            <w:r>
+              <w:rPr>
+                <w:rFonts w:ascii="Consolas" w:cs="Consolas" w:eastAsia="Consolas" w:hAnsi="Consolas"/>
+                <w:sz w:val="19"/>
+                <w:szCs w:val="19"/>
+              </w:rPr>
+              <w:t xml:space="preserve">"X-User"</w:t>
+            </w:r>
+            <w:r>
+              <w:t xml:space="preserve"> (your name — how you appear in the server log).</w:t>
+            </w:r>
+          </w:p>
+        </w:tc>
+      </w:tr>
+    </w:tbl>
+    <w:p>
+      <w:pPr>
+        <w:spacing w:after="120" w:line="276"/>
+      </w:pPr>
+      <w:r>
+        <w:t xml:space="preserve">Already have an </w:t>
+      </w:r>
+      <w:r>
+        <w:rPr>
+          <w:rFonts w:ascii="Consolas" w:cs="Consolas" w:eastAsia="Consolas" w:hAnsi="Consolas"/>
+          <w:sz w:val="19"/>
+          <w:szCs w:val="19"/>
+        </w:rPr>
+        <w:t xml:space="preserve">opencode.json</w:t>
+      </w:r>
+      <w:r>
+        <w:t xml:space="preserve">? Add just this </w:t>
+      </w:r>
+      <w:r>
+        <w:rPr>
+          <w:rFonts w:ascii="Consolas" w:cs="Consolas" w:eastAsia="Consolas" w:hAnsi="Consolas"/>
+          <w:sz w:val="19"/>
+          <w:szCs w:val="19"/>
+        </w:rPr>
+        <w:t xml:space="preserve">mcp</w:t>
+      </w:r>
+      <w:r>
+        <w:t xml:space="preserve"> block as a sibling of </w:t>
+      </w:r>
+      <w:r>
+        <w:rPr>
+          <w:rFonts w:ascii="Consolas" w:cs="Consolas" w:eastAsia="Consolas" w:hAnsi="Consolas"/>
+          <w:sz w:val="19"/>
+          <w:szCs w:val="19"/>
+        </w:rPr>
+        <w:t xml:space="preserve">provider</w:t>
+      </w:r>
+      <w:r>
+        <w:t xml:space="preserve"> (don't create a second config file):</w:t>
+      </w:r>
+    </w:p>
+    <w:tbl>
+      <w:tblPr>
+        <w:tblW w:type="dxa" w:w="9360"/>
+        <w:tblBorders>
+          <w:top w:val="single" w:color="auto" w:sz="4"/>
+          <w:left w:val="single" w:color="auto" w:sz="4"/>
+          <w:bottom w:val="single" w:color="auto" w:sz="4"/>
+          <w:right w:val="single" w:color="auto" w:sz="4"/>
+          <w:insideH w:val="single" w:color="auto" w:sz="4"/>
+          <w:insideV w:val="single" w:color="auto" w:sz="4"/>
+        </w:tblBorders>
+      </w:tblPr>
+      <w:tblGrid>
+        <w:gridCol w:w="9360"/>
+      </w:tblGrid>
+      <w:tr>
+        <w:tc>
+          <w:tcPr>
+            <w:tcW w:type="dxa" w:w="9360"/>
+            <w:tcBorders>
+              <w:top w:val="single" w:color="D9D9D9" w:sz="4"/>
+              <w:left w:val="single" w:color="D9D9D9" w:sz="4"/>
+              <w:bottom w:val="single" w:color="D9D9D9" w:sz="4"/>
+              <w:right w:val="single" w:color="D9D9D9" w:sz="4"/>
+            </w:tcBorders>
+            <w:shd w:fill="F4F4F4" w:val="clear"/>
+            <w:tcMar>
+              <w:top w:type="dxa" w:w="100"/>
+              <w:left w:type="dxa" w:w="150"/>
+              <w:bottom w:type="dxa" w:w="100"/>
+              <w:right w:type="dxa" w:w="150"/>
+            </w:tcMar>
+          </w:tcPr>
+          <w:p>
+            <w:pPr>
+              <w:spacing w:after="0" w:line="252"/>
+            </w:pPr>
+            <w:r>
+              <w:rPr>
+                <w:rFonts w:ascii="Consolas" w:cs="Consolas" w:eastAsia="Consolas" w:hAnsi="Consolas"/>
+                <w:sz w:val="18"/>
+                <w:szCs w:val="18"/>
+              </w:rPr>
+              <w:t xml:space="preserve">"mcp": {</w:t>
+            </w:r>
+          </w:p>
+          <w:p>
+            <w:pPr>
+              <w:spacing w:after="0" w:line="252"/>
+            </w:pPr>
+            <w:r>
+              <w:rPr>
+                <w:rFonts w:ascii="Consolas" w:cs="Consolas" w:eastAsia="Consolas" w:hAnsi="Consolas"/>
+                <w:sz w:val="18"/>
+                <w:szCs w:val="18"/>
+              </w:rPr>
+              <w:t xml:space="preserve">  "msei-publications": {</w:t>
+            </w:r>
+          </w:p>
+          <w:p>
+            <w:pPr>
+              <w:spacing w:after="0" w:line="252"/>
+            </w:pPr>
+            <w:r>
+              <w:rPr>
+                <w:rFonts w:ascii="Consolas" w:cs="Consolas" w:eastAsia="Consolas" w:hAnsi="Consolas"/>
+                <w:sz w:val="18"/>
+                <w:szCs w:val="18"/>
+              </w:rPr>
+              <w:t xml:space="preserve">    "type": "remote",</w:t>
+            </w:r>
+          </w:p>
+          <w:p>
+            <w:pPr>
+              <w:spacing w:after="0" w:line="252"/>
+            </w:pPr>
+            <w:r>
+              <w:rPr>
+                <w:rFonts w:ascii="Consolas" w:cs="Consolas" w:eastAsia="Consolas" w:hAnsi="Consolas"/>
+                <w:sz w:val="18"/>
+                <w:szCs w:val="18"/>
+              </w:rPr>
+              <w:t xml:space="preserve">    "url": "http://10.76.33.35:8080/mcp",</w:t>
+            </w:r>
+          </w:p>
+          <w:p>
+            <w:pPr>
+              <w:spacing w:after="0" w:line="252"/>
+            </w:pPr>
+            <w:r>
+              <w:rPr>
+                <w:rFonts w:ascii="Consolas" w:cs="Consolas" w:eastAsia="Consolas" w:hAnsi="Consolas"/>
+                <w:sz w:val="18"/>
+                <w:szCs w:val="18"/>
+              </w:rPr>
+              <w:t xml:space="preserve">    "enabled": true,</w:t>
+            </w:r>
+          </w:p>
+          <w:p>
+            <w:pPr>
+              <w:spacing w:after="0" w:line="252"/>
+            </w:pPr>
+            <w:r>
+              <w:rPr>
+                <w:rFonts w:ascii="Consolas" w:cs="Consolas" w:eastAsia="Consolas" w:hAnsi="Consolas"/>
+                <w:sz w:val="18"/>
+                <w:szCs w:val="18"/>
+              </w:rPr>
+              <w:t xml:space="preserve">    "headers": { "X-User": "your.name" }</w:t>
             </w:r>
           </w:p>
           <w:p>

</xml_diff>

<commit_message>
fix(docx): valid Word file — wrap table-cell content in paragraphs
Word refused the user guide ('Word experienced an error trying to open the
file') because the table helper placed bare runs directly inside table cells;
OOXML requires every <w:tc> cell's content to be inside a <w:p>. Wrap strings
and bare runs in paragraphs. Now passes OOXML schema validation and opens.
</commit_message>
<xml_diff>
--- a/client-config/MSEI-Publication-Search-User-Guide.docx
+++ b/client-config/MSEI-Publication-Search-User-Guide.docx
@@ -131,7 +131,7 @@
       <w:r>
         <w:t xml:space="preserve"> installed — </w:t>
       </w:r>
-      <w:hyperlink w:history="1" r:id="rIde8hhtsrx7bb0qoopgov-j">
+      <w:hyperlink w:history="1" r:id="rId_3ja1m0tm6tceio9-cukf">
         <w:r>
           <w:rPr>
             <w:rStyle w:val="Hyperlink"/>
@@ -1899,15 +1899,19 @@
               <w:right w:type="dxa" w:w="120"/>
             </w:tcMar>
           </w:tcPr>
-          <w:r>
-            <w:rPr>
-              <w:rFonts w:ascii="Consolas" w:cs="Consolas" w:eastAsia="Consolas" w:hAnsi="Consolas"/>
-              <w:sz w:val="19"/>
-              <w:szCs w:val="19"/>
-            </w:rPr>
-            <w:t xml:space="preserve">model</w:t>
-          </w:r>
-          <w:p/>
+          <w:p>
+            <w:pPr>
+              <w:spacing w:after="0" w:line="264"/>
+            </w:pPr>
+            <w:r>
+              <w:rPr>
+                <w:rFonts w:ascii="Consolas" w:cs="Consolas" w:eastAsia="Consolas" w:hAnsi="Consolas"/>
+                <w:sz w:val="19"/>
+                <w:szCs w:val="19"/>
+              </w:rPr>
+              <w:t xml:space="preserve">model</w:t>
+            </w:r>
+          </w:p>
         </w:tc>
         <w:tc>
           <w:tcPr>
@@ -1978,15 +1982,19 @@
               <w:right w:type="dxa" w:w="120"/>
             </w:tcMar>
           </w:tcPr>
-          <w:r>
-            <w:rPr>
-              <w:rFonts w:ascii="Consolas" w:cs="Consolas" w:eastAsia="Consolas" w:hAnsi="Consolas"/>
-              <w:sz w:val="19"/>
-              <w:szCs w:val="19"/>
-            </w:rPr>
-            <w:t xml:space="preserve">provider.nhr-fau</w:t>
-          </w:r>
-          <w:p/>
+          <w:p>
+            <w:pPr>
+              <w:spacing w:after="0" w:line="264"/>
+            </w:pPr>
+            <w:r>
+              <w:rPr>
+                <w:rFonts w:ascii="Consolas" w:cs="Consolas" w:eastAsia="Consolas" w:hAnsi="Consolas"/>
+                <w:sz w:val="19"/>
+                <w:szCs w:val="19"/>
+              </w:rPr>
+              <w:t xml:space="preserve">provider.nhr-fau</w:t>
+            </w:r>
+          </w:p>
         </w:tc>
         <w:tc>
           <w:tcPr>
@@ -2031,15 +2039,19 @@
               <w:right w:type="dxa" w:w="120"/>
             </w:tcMar>
           </w:tcPr>
-          <w:r>
-            <w:rPr>
-              <w:rFonts w:ascii="Consolas" w:cs="Consolas" w:eastAsia="Consolas" w:hAnsi="Consolas"/>
-              <w:sz w:val="19"/>
-              <w:szCs w:val="19"/>
-            </w:rPr>
-            <w:t xml:space="preserve">options.apiKey</w:t>
-          </w:r>
-          <w:p/>
+          <w:p>
+            <w:pPr>
+              <w:spacing w:after="0" w:line="264"/>
+            </w:pPr>
+            <w:r>
+              <w:rPr>
+                <w:rFonts w:ascii="Consolas" w:cs="Consolas" w:eastAsia="Consolas" w:hAnsi="Consolas"/>
+                <w:sz w:val="19"/>
+                <w:szCs w:val="19"/>
+              </w:rPr>
+              <w:t xml:space="preserve">options.apiKey</w:t>
+            </w:r>
+          </w:p>
         </w:tc>
         <w:tc>
           <w:tcPr>
@@ -2092,15 +2104,19 @@
               <w:right w:type="dxa" w:w="120"/>
             </w:tcMar>
           </w:tcPr>
-          <w:r>
-            <w:rPr>
-              <w:rFonts w:ascii="Consolas" w:cs="Consolas" w:eastAsia="Consolas" w:hAnsi="Consolas"/>
-              <w:sz w:val="19"/>
-              <w:szCs w:val="19"/>
-            </w:rPr>
-            <w:t xml:space="preserve">models</w:t>
-          </w:r>
-          <w:p/>
+          <w:p>
+            <w:pPr>
+              <w:spacing w:after="0" w:line="264"/>
+            </w:pPr>
+            <w:r>
+              <w:rPr>
+                <w:rFonts w:ascii="Consolas" w:cs="Consolas" w:eastAsia="Consolas" w:hAnsi="Consolas"/>
+                <w:sz w:val="19"/>
+                <w:szCs w:val="19"/>
+              </w:rPr>
+              <w:t xml:space="preserve">models</w:t>
+            </w:r>
+          </w:p>
         </w:tc>
         <w:tc>
           <w:tcPr>
@@ -2166,15 +2182,19 @@
               <w:right w:type="dxa" w:w="120"/>
             </w:tcMar>
           </w:tcPr>
-          <w:r>
-            <w:rPr>
-              <w:rFonts w:ascii="Consolas" w:cs="Consolas" w:eastAsia="Consolas" w:hAnsi="Consolas"/>
-              <w:sz w:val="19"/>
-              <w:szCs w:val="19"/>
-            </w:rPr>
-            <w:t xml:space="preserve">mcp.msei-publications.url</w:t>
-          </w:r>
-          <w:p/>
+          <w:p>
+            <w:pPr>
+              <w:spacing w:after="0" w:line="264"/>
+            </w:pPr>
+            <w:r>
+              <w:rPr>
+                <w:rFonts w:ascii="Consolas" w:cs="Consolas" w:eastAsia="Consolas" w:hAnsi="Consolas"/>
+                <w:sz w:val="19"/>
+                <w:szCs w:val="19"/>
+              </w:rPr>
+              <w:t xml:space="preserve">mcp.msei-publications.url</w:t>
+            </w:r>
+          </w:p>
         </w:tc>
         <w:tc>
           <w:tcPr>
@@ -2230,15 +2250,19 @@
               <w:right w:type="dxa" w:w="120"/>
             </w:tcMar>
           </w:tcPr>
-          <w:r>
-            <w:rPr>
-              <w:rFonts w:ascii="Consolas" w:cs="Consolas" w:eastAsia="Consolas" w:hAnsi="Consolas"/>
-              <w:sz w:val="19"/>
-              <w:szCs w:val="19"/>
-            </w:rPr>
-            <w:t xml:space="preserve">headers.X-User</w:t>
-          </w:r>
-          <w:p/>
+          <w:p>
+            <w:pPr>
+              <w:spacing w:after="0" w:line="264"/>
+            </w:pPr>
+            <w:r>
+              <w:rPr>
+                <w:rFonts w:ascii="Consolas" w:cs="Consolas" w:eastAsia="Consolas" w:hAnsi="Consolas"/>
+                <w:sz w:val="19"/>
+                <w:szCs w:val="19"/>
+              </w:rPr>
+              <w:t xml:space="preserve">headers.X-User</w:t>
+            </w:r>
+          </w:p>
         </w:tc>
         <w:tc>
           <w:tcPr>
@@ -2767,15 +2791,19 @@
               <w:right w:type="dxa" w:w="120"/>
             </w:tcMar>
           </w:tcPr>
-          <w:r>
-            <w:rPr>
-              <w:rFonts w:ascii="Consolas" w:cs="Consolas" w:eastAsia="Consolas" w:hAnsi="Consolas"/>
-              <w:sz w:val="19"/>
-              <w:szCs w:val="19"/>
-            </w:rPr>
-            <w:t xml:space="preserve">search_text</w:t>
-          </w:r>
-          <w:p/>
+          <w:p>
+            <w:pPr>
+              <w:spacing w:after="0" w:line="264"/>
+            </w:pPr>
+            <w:r>
+              <w:rPr>
+                <w:rFonts w:ascii="Consolas" w:cs="Consolas" w:eastAsia="Consolas" w:hAnsi="Consolas"/>
+                <w:sz w:val="19"/>
+                <w:szCs w:val="19"/>
+              </w:rPr>
+              <w:t xml:space="preserve">search_text</w:t>
+            </w:r>
+          </w:p>
         </w:tc>
         <w:tc>
           <w:tcPr>
@@ -2820,15 +2848,19 @@
               <w:right w:type="dxa" w:w="120"/>
             </w:tcMar>
           </w:tcPr>
-          <w:r>
-            <w:rPr>
-              <w:rFonts w:ascii="Consolas" w:cs="Consolas" w:eastAsia="Consolas" w:hAnsi="Consolas"/>
-              <w:sz w:val="19"/>
-              <w:szCs w:val="19"/>
-            </w:rPr>
-            <w:t xml:space="preserve">search_publications</w:t>
-          </w:r>
-          <w:p/>
+          <w:p>
+            <w:pPr>
+              <w:spacing w:after="0" w:line="264"/>
+            </w:pPr>
+            <w:r>
+              <w:rPr>
+                <w:rFonts w:ascii="Consolas" w:cs="Consolas" w:eastAsia="Consolas" w:hAnsi="Consolas"/>
+                <w:sz w:val="19"/>
+                <w:szCs w:val="19"/>
+              </w:rPr>
+              <w:t xml:space="preserve">search_publications</w:t>
+            </w:r>
+          </w:p>
         </w:tc>
         <w:tc>
           <w:tcPr>
@@ -2873,15 +2905,19 @@
               <w:right w:type="dxa" w:w="120"/>
             </w:tcMar>
           </w:tcPr>
-          <w:r>
-            <w:rPr>
-              <w:rFonts w:ascii="Consolas" w:cs="Consolas" w:eastAsia="Consolas" w:hAnsi="Consolas"/>
-              <w:sz w:val="19"/>
-              <w:szCs w:val="19"/>
-            </w:rPr>
-            <w:t xml:space="preserve">evidence_pack</w:t>
-          </w:r>
-          <w:p/>
+          <w:p>
+            <w:pPr>
+              <w:spacing w:after="0" w:line="264"/>
+            </w:pPr>
+            <w:r>
+              <w:rPr>
+                <w:rFonts w:ascii="Consolas" w:cs="Consolas" w:eastAsia="Consolas" w:hAnsi="Consolas"/>
+                <w:sz w:val="19"/>
+                <w:szCs w:val="19"/>
+              </w:rPr>
+              <w:t xml:space="preserve">evidence_pack</w:t>
+            </w:r>
+          </w:p>
         </w:tc>
         <w:tc>
           <w:tcPr>
@@ -2926,15 +2962,19 @@
               <w:right w:type="dxa" w:w="120"/>
             </w:tcMar>
           </w:tcPr>
-          <w:r>
-            <w:rPr>
-              <w:rFonts w:ascii="Consolas" w:cs="Consolas" w:eastAsia="Consolas" w:hAnsi="Consolas"/>
-              <w:sz w:val="19"/>
-              <w:szCs w:val="19"/>
-            </w:rPr>
-            <w:t xml:space="preserve">get_publication</w:t>
-          </w:r>
-          <w:p/>
+          <w:p>
+            <w:pPr>
+              <w:spacing w:after="0" w:line="264"/>
+            </w:pPr>
+            <w:r>
+              <w:rPr>
+                <w:rFonts w:ascii="Consolas" w:cs="Consolas" w:eastAsia="Consolas" w:hAnsi="Consolas"/>
+                <w:sz w:val="19"/>
+                <w:szCs w:val="19"/>
+              </w:rPr>
+              <w:t xml:space="preserve">get_publication</w:t>
+            </w:r>
+          </w:p>
         </w:tc>
         <w:tc>
           <w:tcPr>
@@ -2979,15 +3019,19 @@
               <w:right w:type="dxa" w:w="120"/>
             </w:tcMar>
           </w:tcPr>
-          <w:r>
-            <w:rPr>
-              <w:rFonts w:ascii="Consolas" w:cs="Consolas" w:eastAsia="Consolas" w:hAnsi="Consolas"/>
-              <w:sz w:val="19"/>
-              <w:szCs w:val="19"/>
-            </w:rPr>
-            <w:t xml:space="preserve">corpus_stats</w:t>
-          </w:r>
-          <w:p/>
+          <w:p>
+            <w:pPr>
+              <w:spacing w:after="0" w:line="264"/>
+            </w:pPr>
+            <w:r>
+              <w:rPr>
+                <w:rFonts w:ascii="Consolas" w:cs="Consolas" w:eastAsia="Consolas" w:hAnsi="Consolas"/>
+                <w:sz w:val="19"/>
+                <w:szCs w:val="19"/>
+              </w:rPr>
+              <w:t xml:space="preserve">corpus_stats</w:t>
+            </w:r>
+          </w:p>
         </w:tc>
         <w:tc>
           <w:tcPr>
@@ -3032,15 +3076,19 @@
               <w:right w:type="dxa" w:w="120"/>
             </w:tcMar>
           </w:tcPr>
-          <w:r>
-            <w:rPr>
-              <w:rFonts w:ascii="Consolas" w:cs="Consolas" w:eastAsia="Consolas" w:hAnsi="Consolas"/>
-              <w:sz w:val="19"/>
-              <w:szCs w:val="19"/>
-            </w:rPr>
-            <w:t xml:space="preserve">list_keywords</w:t>
-          </w:r>
-          <w:p/>
+          <w:p>
+            <w:pPr>
+              <w:spacing w:after="0" w:line="264"/>
+            </w:pPr>
+            <w:r>
+              <w:rPr>
+                <w:rFonts w:ascii="Consolas" w:cs="Consolas" w:eastAsia="Consolas" w:hAnsi="Consolas"/>
+                <w:sz w:val="19"/>
+                <w:szCs w:val="19"/>
+              </w:rPr>
+              <w:t xml:space="preserve">list_keywords</w:t>
+            </w:r>
+          </w:p>
         </w:tc>
         <w:tc>
           <w:tcPr>
@@ -3085,15 +3133,19 @@
               <w:right w:type="dxa" w:w="120"/>
             </w:tcMar>
           </w:tcPr>
-          <w:r>
-            <w:rPr>
-              <w:rFonts w:ascii="Consolas" w:cs="Consolas" w:eastAsia="Consolas" w:hAnsi="Consolas"/>
-              <w:sz w:val="19"/>
-              <w:szCs w:val="19"/>
-            </w:rPr>
-            <w:t xml:space="preserve">facet_counts</w:t>
-          </w:r>
-          <w:p/>
+          <w:p>
+            <w:pPr>
+              <w:spacing w:after="0" w:line="264"/>
+            </w:pPr>
+            <w:r>
+              <w:rPr>
+                <w:rFonts w:ascii="Consolas" w:cs="Consolas" w:eastAsia="Consolas" w:hAnsi="Consolas"/>
+                <w:sz w:val="19"/>
+                <w:szCs w:val="19"/>
+              </w:rPr>
+              <w:t xml:space="preserve">facet_counts</w:t>
+            </w:r>
+          </w:p>
         </w:tc>
         <w:tc>
           <w:tcPr>
@@ -3138,15 +3190,19 @@
               <w:right w:type="dxa" w:w="120"/>
             </w:tcMar>
           </w:tcPr>
-          <w:r>
-            <w:rPr>
-              <w:rFonts w:ascii="Consolas" w:cs="Consolas" w:eastAsia="Consolas" w:hAnsi="Consolas"/>
-              <w:sz w:val="19"/>
-              <w:szCs w:val="19"/>
-            </w:rPr>
-            <w:t xml:space="preserve">find_citing_publications</w:t>
-          </w:r>
-          <w:p/>
+          <w:p>
+            <w:pPr>
+              <w:spacing w:after="0" w:line="264"/>
+            </w:pPr>
+            <w:r>
+              <w:rPr>
+                <w:rFonts w:ascii="Consolas" w:cs="Consolas" w:eastAsia="Consolas" w:hAnsi="Consolas"/>
+                <w:sz w:val="19"/>
+                <w:szCs w:val="19"/>
+              </w:rPr>
+              <w:t xml:space="preserve">find_citing_publications</w:t>
+            </w:r>
+          </w:p>
         </w:tc>
         <w:tc>
           <w:tcPr>
@@ -3540,18 +3596,27 @@
               <w:right w:type="dxa" w:w="120"/>
             </w:tcMar>
           </w:tcPr>
-          <w:r>
-            <w:rPr>
-              <w:rFonts w:ascii="Consolas" w:cs="Consolas" w:eastAsia="Consolas" w:hAnsi="Consolas"/>
-              <w:sz w:val="19"/>
-              <w:szCs w:val="19"/>
-            </w:rPr>
-            <w:t xml:space="preserve">EndOfFileExpected</w:t>
-          </w:r>
-          <w:r>
-            <w:t xml:space="preserve"> / JSON error</w:t>
-          </w:r>
-          <w:p/>
+          <w:p>
+            <w:pPr>
+              <w:spacing w:after="0" w:line="264"/>
+            </w:pPr>
+            <w:r>
+              <w:rPr>
+                <w:rFonts w:ascii="Consolas" w:cs="Consolas" w:eastAsia="Consolas" w:hAnsi="Consolas"/>
+                <w:sz w:val="19"/>
+                <w:szCs w:val="19"/>
+              </w:rPr>
+              <w:t xml:space="preserve">EndOfFileExpected</w:t>
+            </w:r>
+          </w:p>
+          <w:p>
+            <w:pPr>
+              <w:spacing w:after="0" w:line="264"/>
+            </w:pPr>
+            <w:r>
+              <w:t xml:space="preserve"> / JSON error</w:t>
+            </w:r>
+          </w:p>
         </w:tc>
         <w:tc>
           <w:tcPr>
@@ -3771,18 +3836,27 @@
               <w:right w:type="dxa" w:w="120"/>
             </w:tcMar>
           </w:tcPr>
-          <w:r>
-            <w:rPr>
-              <w:rFonts w:ascii="Consolas" w:cs="Consolas" w:eastAsia="Consolas" w:hAnsi="Consolas"/>
-              <w:sz w:val="19"/>
-              <w:szCs w:val="19"/>
-            </w:rPr>
-            <w:t xml:space="preserve">msei-publications</w:t>
-          </w:r>
-          <w:r>
-            <w:t xml:space="preserve"> red dot</w:t>
-          </w:r>
-          <w:p/>
+          <w:p>
+            <w:pPr>
+              <w:spacing w:after="0" w:line="264"/>
+            </w:pPr>
+            <w:r>
+              <w:rPr>
+                <w:rFonts w:ascii="Consolas" w:cs="Consolas" w:eastAsia="Consolas" w:hAnsi="Consolas"/>
+                <w:sz w:val="19"/>
+                <w:szCs w:val="19"/>
+              </w:rPr>
+              <w:t xml:space="preserve">msei-publications</w:t>
+            </w:r>
+          </w:p>
+          <w:p>
+            <w:pPr>
+              <w:spacing w:after="0" w:line="264"/>
+            </w:pPr>
+            <w:r>
+              <w:t xml:space="preserve"> red dot</w:t>
+            </w:r>
+          </w:p>
         </w:tc>
         <w:tc>
           <w:tcPr>

</xml_diff>

<commit_message>
feat: external discovery via Crossref + OpenAlex (search_external et al.)
Adds 3 tools to the same MCP server (24 -> 27): search_external (query
Crossref+OpenAlex for related work not in the local library, flagged
in_local_library), get_external_work (DOI -> merged metadata + abstract), and
resolve_reference (fuzzy citation -> DOI). Reuses the reference repo's proven
crossref-openalex backend (HTTP + OpenAlex abstract reconstruction + SQLite TTL
cache); local-DOI dedup done against materials_v2_summaries. Proxy-aware
(requests honors HTTP_PROXY). Config: CONTACT_EMAIL, EXTERNAL_SEARCH (on),
XREF_CACHE_DB. Deps: requests, PyYAML. Docs/13 + README/docs/07 + Word guide
(.docx/.pdf). Verified: 27 tools register; live Crossref/OpenAlex calls work
(OpenAlex 503 handled gracefully).
</commit_message>
<xml_diff>
--- a/client-config/MSEI-Publication-Search-User-Guide.docx
+++ b/client-config/MSEI-Publication-Search-User-Guide.docx
@@ -131,7 +131,7 @@
       <w:r>
         <w:t xml:space="preserve"> installed — </w:t>
       </w:r>
-      <w:hyperlink w:history="1" r:id="rId_3ja1m0tm6tceio9-cukf">
+      <w:hyperlink w:history="1" r:id="rIdehdmoypyajs7x73p98qck">
         <w:r>
           <w:rPr>
             <w:rStyle w:val="Hyperlink"/>
@@ -3226,6 +3226,120 @@
             </w:pPr>
             <w:r>
               <w:t xml:space="preserve">Citation graph — which corpus publications cite a given DOI.</w:t>
+            </w:r>
+          </w:p>
+        </w:tc>
+      </w:tr>
+      <w:tr>
+        <w:tc>
+          <w:tcPr>
+            <w:tcW w:type="dxa" w:w="2700"/>
+            <w:tcBorders>
+              <w:top w:val="single" w:color="D9D9D9" w:sz="4"/>
+              <w:left w:val="single" w:color="D9D9D9" w:sz="4"/>
+              <w:bottom w:val="single" w:color="D9D9D9" w:sz="4"/>
+              <w:right w:val="single" w:color="D9D9D9" w:sz="4"/>
+            </w:tcBorders>
+            <w:tcMar>
+              <w:top w:type="dxa" w:w="70"/>
+              <w:left w:type="dxa" w:w="120"/>
+              <w:bottom w:type="dxa" w:w="70"/>
+              <w:right w:type="dxa" w:w="120"/>
+            </w:tcMar>
+          </w:tcPr>
+          <w:p>
+            <w:pPr>
+              <w:spacing w:after="0" w:line="264"/>
+            </w:pPr>
+            <w:r>
+              <w:rPr>
+                <w:rFonts w:ascii="Consolas" w:cs="Consolas" w:eastAsia="Consolas" w:hAnsi="Consolas"/>
+                <w:sz w:val="19"/>
+                <w:szCs w:val="19"/>
+              </w:rPr>
+              <w:t xml:space="preserve">search_external</w:t>
+            </w:r>
+          </w:p>
+        </w:tc>
+        <w:tc>
+          <w:tcPr>
+            <w:tcW w:type="dxa" w:w="6660"/>
+            <w:tcBorders>
+              <w:top w:val="single" w:color="D9D9D9" w:sz="4"/>
+              <w:left w:val="single" w:color="D9D9D9" w:sz="4"/>
+              <w:bottom w:val="single" w:color="D9D9D9" w:sz="4"/>
+              <w:right w:val="single" w:color="D9D9D9" w:sz="4"/>
+            </w:tcBorders>
+            <w:tcMar>
+              <w:top w:type="dxa" w:w="70"/>
+              <w:left w:type="dxa" w:w="120"/>
+              <w:bottom w:type="dxa" w:w="70"/>
+              <w:right w:type="dxa" w:w="120"/>
+            </w:tcMar>
+          </w:tcPr>
+          <w:p>
+            <w:pPr>
+              <w:spacing w:after="0" w:line="264"/>
+            </w:pPr>
+            <w:r>
+              <w:t xml:space="preserve">Find related work NOT in our library, via Crossref + OpenAlex — DOI, abstract, metadata (flagged if already in the library).</w:t>
+            </w:r>
+          </w:p>
+        </w:tc>
+      </w:tr>
+      <w:tr>
+        <w:tc>
+          <w:tcPr>
+            <w:tcW w:type="dxa" w:w="2700"/>
+            <w:tcBorders>
+              <w:top w:val="single" w:color="D9D9D9" w:sz="4"/>
+              <w:left w:val="single" w:color="D9D9D9" w:sz="4"/>
+              <w:bottom w:val="single" w:color="D9D9D9" w:sz="4"/>
+              <w:right w:val="single" w:color="D9D9D9" w:sz="4"/>
+            </w:tcBorders>
+            <w:tcMar>
+              <w:top w:type="dxa" w:w="70"/>
+              <w:left w:type="dxa" w:w="120"/>
+              <w:bottom w:type="dxa" w:w="70"/>
+              <w:right w:type="dxa" w:w="120"/>
+            </w:tcMar>
+          </w:tcPr>
+          <w:p>
+            <w:pPr>
+              <w:spacing w:after="0" w:line="264"/>
+            </w:pPr>
+            <w:r>
+              <w:rPr>
+                <w:rFonts w:ascii="Consolas" w:cs="Consolas" w:eastAsia="Consolas" w:hAnsi="Consolas"/>
+                <w:sz w:val="19"/>
+                <w:szCs w:val="19"/>
+              </w:rPr>
+              <w:t xml:space="preserve">get_external_work</w:t>
+            </w:r>
+          </w:p>
+        </w:tc>
+        <w:tc>
+          <w:tcPr>
+            <w:tcW w:type="dxa" w:w="6660"/>
+            <w:tcBorders>
+              <w:top w:val="single" w:color="D9D9D9" w:sz="4"/>
+              <w:left w:val="single" w:color="D9D9D9" w:sz="4"/>
+              <w:bottom w:val="single" w:color="D9D9D9" w:sz="4"/>
+              <w:right w:val="single" w:color="D9D9D9" w:sz="4"/>
+            </w:tcBorders>
+            <w:tcMar>
+              <w:top w:type="dxa" w:w="70"/>
+              <w:left w:type="dxa" w:w="120"/>
+              <w:bottom w:type="dxa" w:w="70"/>
+              <w:right w:type="dxa" w:w="120"/>
+            </w:tcMar>
+          </w:tcPr>
+          <w:p>
+            <w:pPr>
+              <w:spacing w:after="0" w:line="264"/>
+            </w:pPr>
+            <w:r>
+              <w:t xml:space="preserve">Fetch a DOI's metadata + abstract from Crossref/OpenAlex.</w:t>
             </w:r>
           </w:p>
         </w:tc>

</xml_diff>